<commit_message>
Update Team Meeting 8 topics to AI Training debatable questions
Replace Employee/Employer perspectives with Agree/Disagree format
using 6 new debatable questions from AI Training activity.

Co-Authored-By: Claude Opus 4.6 (1M context) <noreply@anthropic.com>
</commit_message>
<xml_diff>
--- a/Team-Meeting-8.docx
+++ b/Team-Meeting-8.docx
@@ -509,7 +509,7 @@
         <w:t xml:space="preserve"> </w:t>
       </w:r>
       <w:r>
-        <w:t xml:space="preserve">activity on Training Human Resources topics. You will be paired with a partner and take turns persuading each other from either the employee or employer perspective. Every person speaks, and roles swap each round.</w:t>
+        <w:t xml:space="preserve">activity on Training Human Resources topics. You will be paired with a partner and take turns persuading each other from either the Agree or Disagree perspective. Every person speaks, and roles swap each round.</w:t>
       </w:r>
     </w:p>
     <w:p>
@@ -644,7 +644,7 @@
           <w:b/>
           <w:bCs/>
         </w:rPr>
-        <w:t xml:space="preserve">Employee Advocate</w:t>
+        <w:t xml:space="preserve">Agree Advocate</w:t>
       </w:r>
       <w:r>
         <w:t xml:space="preserve"> </w:t>
@@ -660,7 +660,7 @@
           <w:b/>
           <w:bCs/>
         </w:rPr>
-        <w:t xml:space="preserve">Employer Advocate</w:t>
+        <w:t xml:space="preserve">Disagree Advocate</w:t>
       </w:r>
       <w:r>
         <w:t xml:space="preserve">. Roles will swap after each round.</w:t>
@@ -682,552 +682,6 @@
       </w:r>
       <w:r>
         <w:t xml:space="preserve">If you had an odd number, the Notetaker pairs with the remaining member.</w:t>
-      </w:r>
-    </w:p>
-    <w:tbl>
-      <w:tblPr>
-        <w:tblW w:type="pct" w:w="5000"/>
-        <w:tblStyle w:val="Table"/>
-        <w:tblLayout w:type="fixed"/>
-        <w:tblLook w:firstRow="1" w:lastRow="0" w:firstColumn="0" w:lastColumn="0" w:noHBand="0" w:noVBand="0" w:val="0020"/>
-        <w:tblBorders>
-          <w:top w:val="single" w:sz="4" w:space="0" w:color="000000"/>
-          <w:left w:val="single" w:sz="4" w:space="0" w:color="000000"/>
-          <w:bottom w:val="single" w:sz="4" w:space="0" w:color="000000"/>
-          <w:right w:val="single" w:sz="4" w:space="0" w:color="000000"/>
-          <w:insideH w:val="single" w:sz="4" w:space="0" w:color="000000"/>
-          <w:insideV w:val="single" w:sz="4" w:space="0" w:color="000000"/>
-        </w:tblBorders>
-      </w:tblPr>
-      <w:tblGrid>
-        <w:gridCol w:w="698"/>
-        <w:gridCol w:w="3610"/>
-        <w:gridCol w:w="3610"/>
-      </w:tblGrid>
-      <w:tr>
-        <w:trPr>
-          <w:tblHeader w:val="on"/>
-        </w:trPr>
-        <w:tc>
-          <w:tcPr/>
-          <w:p>
-            <w:pPr>
-              <w:pStyle w:val="Compact"/>
-            </w:pPr>
-            <w:r>
-              <w:t xml:space="preserve">Pair</w:t>
-            </w:r>
-          </w:p>
-        </w:tc>
-        <w:tc>
-          <w:tcPr/>
-          <w:p>
-            <w:pPr>
-              <w:pStyle w:val="Compact"/>
-            </w:pPr>
-            <w:r>
-              <w:t xml:space="preserve">Partner A (starts as Employee)</w:t>
-            </w:r>
-          </w:p>
-        </w:tc>
-        <w:tc>
-          <w:tcPr/>
-          <w:p>
-            <w:pPr>
-              <w:pStyle w:val="Compact"/>
-            </w:pPr>
-            <w:r>
-              <w:t xml:space="preserve">Partner B (starts as Employer)</w:t>
-            </w:r>
-          </w:p>
-        </w:tc>
-      </w:tr>
-      <w:tr>
-        <w:tc>
-          <w:tcPr/>
-          <w:p>
-            <w:pPr>
-              <w:pStyle w:val="Compact"/>
-            </w:pPr>
-            <w:r>
-              <w:t xml:space="preserve">Pair 1</w:t>
-            </w:r>
-          </w:p>
-        </w:tc>
-        <w:tc>
-          <w:tcPr/>
-          <w:p>
-            <w:pPr>
-              <w:pStyle w:val="Compact"/>
-            </w:pPr>
-          </w:p>
-        </w:tc>
-        <w:tc>
-          <w:tcPr/>
-          <w:p>
-            <w:pPr>
-              <w:pStyle w:val="Compact"/>
-            </w:pPr>
-          </w:p>
-        </w:tc>
-      </w:tr>
-      <w:tr>
-        <w:tc>
-          <w:tcPr/>
-          <w:p>
-            <w:pPr>
-              <w:pStyle w:val="Compact"/>
-            </w:pPr>
-            <w:r>
-              <w:t xml:space="preserve">Pair 2</w:t>
-            </w:r>
-          </w:p>
-        </w:tc>
-        <w:tc>
-          <w:tcPr/>
-          <w:p>
-            <w:pPr>
-              <w:pStyle w:val="Compact"/>
-            </w:pPr>
-          </w:p>
-        </w:tc>
-        <w:tc>
-          <w:tcPr/>
-          <w:p>
-            <w:pPr>
-              <w:pStyle w:val="Compact"/>
-            </w:pPr>
-          </w:p>
-        </w:tc>
-      </w:tr>
-      <w:tr>
-        <w:tc>
-          <w:tcPr/>
-          <w:p>
-            <w:pPr>
-              <w:pStyle w:val="Compact"/>
-            </w:pPr>
-            <w:r>
-              <w:t xml:space="preserve">Pair 3</w:t>
-            </w:r>
-          </w:p>
-        </w:tc>
-        <w:tc>
-          <w:tcPr/>
-          <w:p>
-            <w:pPr>
-              <w:pStyle w:val="Compact"/>
-            </w:pPr>
-          </w:p>
-        </w:tc>
-        <w:tc>
-          <w:tcPr/>
-          <w:p>
-            <w:pPr>
-              <w:pStyle w:val="Compact"/>
-            </w:pPr>
-          </w:p>
-        </w:tc>
-      </w:tr>
-    </w:tbl>
-    <w:p>
-      <w:r>
-        <w:pict>
-          <v:rect style="width:0;height:1.5pt" o:hralign="center" o:hrstd="t" o:hr="t"/>
-        </w:pict>
-      </w:r>
-    </w:p>
-    <w:bookmarkEnd w:id="15"/>
-    <w:bookmarkStart w:id="16" w:name="minute-select-todays-topics"/>
-    <w:p>
-      <w:pPr>
-        <w:pStyle w:val="Heading3"/>
-      </w:pPr>
-      <w:r>
-        <w:t xml:space="preserve">[1 minute] Select Today’s Topics</w:t>
-      </w:r>
-    </w:p>
-    <w:p>
-      <w:pPr>
-        <w:pStyle w:val="FirstParagraph"/>
-      </w:pPr>
-      <w:r>
-        <w:t xml:space="preserve">Choose</w:t>
-      </w:r>
-      <w:r>
-        <w:t xml:space="preserve"> </w:t>
-      </w:r>
-      <w:r>
-        <w:rPr>
-          <w:b/>
-          <w:bCs/>
-        </w:rPr>
-        <w:t xml:space="preserve">2 topics</w:t>
-      </w:r>
-      <w:r>
-        <w:t xml:space="preserve"> </w:t>
-      </w:r>
-      <w:r>
-        <w:t xml:space="preserve">from the list below for today’s activity.</w:t>
-      </w:r>
-    </w:p>
-    <w:tbl>
-      <w:tblPr>
-        <w:tblW w:type="pct" w:w="5000"/>
-        <w:tblStyle w:val="Table"/>
-        <w:tblLayout w:type="fixed"/>
-        <w:tblLook w:firstRow="1" w:lastRow="0" w:firstColumn="0" w:lastColumn="0" w:noHBand="0" w:noVBand="0" w:val="0020"/>
-        <w:tblBorders>
-          <w:top w:val="single" w:sz="4" w:space="0" w:color="000000"/>
-          <w:left w:val="single" w:sz="4" w:space="0" w:color="000000"/>
-          <w:bottom w:val="single" w:sz="4" w:space="0" w:color="000000"/>
-          <w:right w:val="single" w:sz="4" w:space="0" w:color="000000"/>
-          <w:insideH w:val="single" w:sz="4" w:space="0" w:color="000000"/>
-          <w:insideV w:val="single" w:sz="4" w:space="0" w:color="000000"/>
-        </w:tblBorders>
-      </w:tblPr>
-      <w:tblGrid>
-        <w:gridCol w:w="456"/>
-        <w:gridCol w:w="1066"/>
-        <w:gridCol w:w="3198"/>
-        <w:gridCol w:w="3198"/>
-      </w:tblGrid>
-      <w:tr>
-        <w:trPr>
-          <w:tblHeader w:val="on"/>
-        </w:trPr>
-        <w:tc>
-          <w:tcPr/>
-          <w:p>
-            <w:pPr>
-              <w:pStyle w:val="Compact"/>
-            </w:pPr>
-            <w:r>
-              <w:t xml:space="preserve">#</w:t>
-            </w:r>
-          </w:p>
-        </w:tc>
-        <w:tc>
-          <w:tcPr/>
-          <w:p>
-            <w:pPr>
-              <w:pStyle w:val="Compact"/>
-            </w:pPr>
-            <w:r>
-              <w:t xml:space="preserve">Topic</w:t>
-            </w:r>
-          </w:p>
-        </w:tc>
-        <w:tc>
-          <w:tcPr/>
-          <w:p>
-            <w:pPr>
-              <w:pStyle w:val="Compact"/>
-            </w:pPr>
-            <w:r>
-              <w:t xml:space="preserve">Employee Perspective</w:t>
-            </w:r>
-          </w:p>
-        </w:tc>
-        <w:tc>
-          <w:tcPr/>
-          <w:p>
-            <w:pPr>
-              <w:pStyle w:val="Compact"/>
-            </w:pPr>
-            <w:r>
-              <w:t xml:space="preserve">Employer Perspective</w:t>
-            </w:r>
-          </w:p>
-        </w:tc>
-      </w:tr>
-      <w:tr>
-        <w:tc>
-          <w:tcPr/>
-          <w:p>
-            <w:pPr>
-              <w:pStyle w:val="Compact"/>
-            </w:pPr>
-            <w:r>
-              <w:t xml:space="preserve">1</w:t>
-            </w:r>
-          </w:p>
-        </w:tc>
-        <w:tc>
-          <w:tcPr/>
-          <w:p>
-            <w:pPr>
-              <w:pStyle w:val="Compact"/>
-            </w:pPr>
-            <w:r>
-              <w:t xml:space="preserve">Should employees repay training costs if they leave the company early?</w:t>
-            </w:r>
-          </w:p>
-        </w:tc>
-        <w:tc>
-          <w:tcPr/>
-          <w:p>
-            <w:pPr>
-              <w:pStyle w:val="Compact"/>
-            </w:pPr>
-            <w:r>
-              <w:t xml:space="preserve">Repayment requirements trap employees and limit career mobility</w:t>
-            </w:r>
-          </w:p>
-        </w:tc>
-        <w:tc>
-          <w:tcPr/>
-          <w:p>
-            <w:pPr>
-              <w:pStyle w:val="Compact"/>
-            </w:pPr>
-            <w:r>
-              <w:t xml:space="preserve">Repayment agreements protect company investments and ensure commitment</w:t>
-            </w:r>
-          </w:p>
-        </w:tc>
-      </w:tr>
-      <w:tr>
-        <w:tc>
-          <w:tcPr/>
-          <w:p>
-            <w:pPr>
-              <w:pStyle w:val="Compact"/>
-            </w:pPr>
-            <w:r>
-              <w:t xml:space="preserve">2</w:t>
-            </w:r>
-          </w:p>
-        </w:tc>
-        <w:tc>
-          <w:tcPr/>
-          <w:p>
-            <w:pPr>
-              <w:pStyle w:val="Compact"/>
-            </w:pPr>
-            <w:r>
-              <w:t xml:space="preserve">Should training programs be mandatory or voluntary for employees?</w:t>
-            </w:r>
-          </w:p>
-        </w:tc>
-        <w:tc>
-          <w:tcPr/>
-          <w:p>
-            <w:pPr>
-              <w:pStyle w:val="Compact"/>
-            </w:pPr>
-            <w:r>
-              <w:t xml:space="preserve">Mandatory training takes time from core work and may not be relevant</w:t>
-            </w:r>
-          </w:p>
-        </w:tc>
-        <w:tc>
-          <w:tcPr/>
-          <w:p>
-            <w:pPr>
-              <w:pStyle w:val="Compact"/>
-            </w:pPr>
-            <w:r>
-              <w:t xml:space="preserve">Mandatory training ensures consistent skill levels across the organization</w:t>
-            </w:r>
-          </w:p>
-        </w:tc>
-      </w:tr>
-      <w:tr>
-        <w:tc>
-          <w:tcPr/>
-          <w:p>
-            <w:pPr>
-              <w:pStyle w:val="Compact"/>
-            </w:pPr>
-            <w:r>
-              <w:t xml:space="preserve">3</w:t>
-            </w:r>
-          </w:p>
-        </w:tc>
-        <w:tc>
-          <w:tcPr/>
-          <w:p>
-            <w:pPr>
-              <w:pStyle w:val="Compact"/>
-            </w:pPr>
-            <w:r>
-              <w:t xml:space="preserve">Should companies invest in training or hire experienced candidates?</w:t>
-            </w:r>
-          </w:p>
-        </w:tc>
-        <w:tc>
-          <w:tcPr/>
-          <w:p>
-            <w:pPr>
-              <w:pStyle w:val="Compact"/>
-            </w:pPr>
-            <w:r>
-              <w:t xml:space="preserve">Training shows investment in employees and builds loyalty</w:t>
-            </w:r>
-          </w:p>
-        </w:tc>
-        <w:tc>
-          <w:tcPr/>
-          <w:p>
-            <w:pPr>
-              <w:pStyle w:val="Compact"/>
-            </w:pPr>
-            <w:r>
-              <w:t xml:space="preserve">Hiring experienced candidates provides immediate productivity</w:t>
-            </w:r>
-          </w:p>
-        </w:tc>
-      </w:tr>
-      <w:tr>
-        <w:tc>
-          <w:tcPr/>
-          <w:p>
-            <w:pPr>
-              <w:pStyle w:val="Compact"/>
-            </w:pPr>
-            <w:r>
-              <w:t xml:space="preserve">4</w:t>
-            </w:r>
-          </w:p>
-        </w:tc>
-        <w:tc>
-          <w:tcPr/>
-          <w:p>
-            <w:pPr>
-              <w:pStyle w:val="Compact"/>
-            </w:pPr>
-            <w:r>
-              <w:t xml:space="preserve">Should employees be compensated for training time outside work hours?</w:t>
-            </w:r>
-          </w:p>
-        </w:tc>
-        <w:tc>
-          <w:tcPr/>
-          <w:p>
-            <w:pPr>
-              <w:pStyle w:val="Compact"/>
-            </w:pPr>
-            <w:r>
-              <w:t xml:space="preserve">Unpaid training exploits employees and violates work-life balance</w:t>
-            </w:r>
-          </w:p>
-        </w:tc>
-        <w:tc>
-          <w:tcPr/>
-          <w:p>
-            <w:pPr>
-              <w:pStyle w:val="Compact"/>
-            </w:pPr>
-            <w:r>
-              <w:t xml:space="preserve">Training is an investment in employees that benefits their careers</w:t>
-            </w:r>
-          </w:p>
-        </w:tc>
-      </w:tr>
-      <w:tr>
-        <w:tc>
-          <w:tcPr/>
-          <w:p>
-            <w:pPr>
-              <w:pStyle w:val="Compact"/>
-            </w:pPr>
-            <w:r>
-              <w:t xml:space="preserve">5</w:t>
-            </w:r>
-          </w:p>
-        </w:tc>
-        <w:tc>
-          <w:tcPr/>
-          <w:p>
-            <w:pPr>
-              <w:pStyle w:val="Compact"/>
-            </w:pPr>
-            <w:r>
-              <w:t xml:space="preserve">Should companies use online training or in-person training?</w:t>
-            </w:r>
-          </w:p>
-        </w:tc>
-        <w:tc>
-          <w:tcPr/>
-          <w:p>
-            <w:pPr>
-              <w:pStyle w:val="Compact"/>
-            </w:pPr>
-            <w:r>
-              <w:t xml:space="preserve">In-person training provides better engagement and networking</w:t>
-            </w:r>
-          </w:p>
-        </w:tc>
-        <w:tc>
-          <w:tcPr/>
-          <w:p>
-            <w:pPr>
-              <w:pStyle w:val="Compact"/>
-            </w:pPr>
-            <w:r>
-              <w:t xml:space="preserve">Online training is cost-effective, flexible, and scalable</w:t>
-            </w:r>
-          </w:p>
-        </w:tc>
-      </w:tr>
-      <w:tr>
-        <w:tc>
-          <w:tcPr/>
-          <w:p>
-            <w:pPr>
-              <w:pStyle w:val="Compact"/>
-            </w:pPr>
-            <w:r>
-              <w:t xml:space="preserve">6</w:t>
-            </w:r>
-          </w:p>
-        </w:tc>
-        <w:tc>
-          <w:tcPr/>
-          <w:p>
-            <w:pPr>
-              <w:pStyle w:val="Compact"/>
-            </w:pPr>
-            <w:r>
-              <w:t xml:space="preserve">Should companies focus training on all employees or high performers only?</w:t>
-            </w:r>
-          </w:p>
-        </w:tc>
-        <w:tc>
-          <w:tcPr/>
-          <w:p>
-            <w:pPr>
-              <w:pStyle w:val="Compact"/>
-            </w:pPr>
-            <w:r>
-              <w:t xml:space="preserve">All employees deserve development opportunities equally</w:t>
-            </w:r>
-          </w:p>
-        </w:tc>
-        <w:tc>
-          <w:tcPr/>
-          <w:p>
-            <w:pPr>
-              <w:pStyle w:val="Compact"/>
-            </w:pPr>
-            <w:r>
-              <w:t xml:space="preserve">Focusing on high performers maximizes return on training investment</w:t>
-            </w:r>
-          </w:p>
-        </w:tc>
-      </w:tr>
-    </w:tbl>
-    <w:p>
-      <w:pPr>
-        <w:pStyle w:val="BodyText"/>
-      </w:pPr>
-      <w:r>
-        <w:rPr>
-          <w:b/>
-          <w:bCs/>
-        </w:rPr>
-        <w:t xml:space="preserve">Our team’s selected topics:</w:t>
       </w:r>
     </w:p>
     <w:tbl>
@@ -1260,6 +714,551 @@
               <w:pStyle w:val="Compact"/>
             </w:pPr>
             <w:r>
+              <w:t xml:space="preserve">Pair</w:t>
+            </w:r>
+          </w:p>
+        </w:tc>
+        <w:tc>
+          <w:tcPr/>
+          <w:p>
+            <w:pPr>
+              <w:pStyle w:val="Compact"/>
+            </w:pPr>
+            <w:r>
+              <w:t xml:space="preserve">Partner A (starts as Agree)</w:t>
+            </w:r>
+          </w:p>
+        </w:tc>
+        <w:tc>
+          <w:tcPr/>
+          <w:p>
+            <w:pPr>
+              <w:pStyle w:val="Compact"/>
+            </w:pPr>
+            <w:r>
+              <w:t xml:space="preserve">Partner B (starts as Disagree)</w:t>
+            </w:r>
+          </w:p>
+        </w:tc>
+      </w:tr>
+      <w:tr>
+        <w:tc>
+          <w:tcPr/>
+          <w:p>
+            <w:pPr>
+              <w:pStyle w:val="Compact"/>
+            </w:pPr>
+            <w:r>
+              <w:t xml:space="preserve">Pair 1</w:t>
+            </w:r>
+          </w:p>
+        </w:tc>
+        <w:tc>
+          <w:tcPr/>
+          <w:p>
+            <w:pPr>
+              <w:pStyle w:val="Compact"/>
+            </w:pPr>
+          </w:p>
+        </w:tc>
+        <w:tc>
+          <w:tcPr/>
+          <w:p>
+            <w:pPr>
+              <w:pStyle w:val="Compact"/>
+            </w:pPr>
+          </w:p>
+        </w:tc>
+      </w:tr>
+      <w:tr>
+        <w:tc>
+          <w:tcPr/>
+          <w:p>
+            <w:pPr>
+              <w:pStyle w:val="Compact"/>
+            </w:pPr>
+            <w:r>
+              <w:t xml:space="preserve">Pair 2</w:t>
+            </w:r>
+          </w:p>
+        </w:tc>
+        <w:tc>
+          <w:tcPr/>
+          <w:p>
+            <w:pPr>
+              <w:pStyle w:val="Compact"/>
+            </w:pPr>
+          </w:p>
+        </w:tc>
+        <w:tc>
+          <w:tcPr/>
+          <w:p>
+            <w:pPr>
+              <w:pStyle w:val="Compact"/>
+            </w:pPr>
+          </w:p>
+        </w:tc>
+      </w:tr>
+      <w:tr>
+        <w:tc>
+          <w:tcPr/>
+          <w:p>
+            <w:pPr>
+              <w:pStyle w:val="Compact"/>
+            </w:pPr>
+            <w:r>
+              <w:t xml:space="preserve">Pair 3</w:t>
+            </w:r>
+          </w:p>
+        </w:tc>
+        <w:tc>
+          <w:tcPr/>
+          <w:p>
+            <w:pPr>
+              <w:pStyle w:val="Compact"/>
+            </w:pPr>
+          </w:p>
+        </w:tc>
+        <w:tc>
+          <w:tcPr/>
+          <w:p>
+            <w:pPr>
+              <w:pStyle w:val="Compact"/>
+            </w:pPr>
+          </w:p>
+        </w:tc>
+      </w:tr>
+    </w:tbl>
+    <w:p>
+      <w:r>
+        <w:pict>
+          <v:rect style="width:0;height:1.5pt" o:hralign="center" o:hrstd="t" o:hr="t"/>
+        </w:pict>
+      </w:r>
+    </w:p>
+    <w:bookmarkEnd w:id="15"/>
+    <w:bookmarkStart w:id="16" w:name="minute-select-todays-topics"/>
+    <w:p>
+      <w:pPr>
+        <w:pStyle w:val="Heading3"/>
+      </w:pPr>
+      <w:r>
+        <w:t xml:space="preserve">[1 minute] Select Today’s Topics</w:t>
+      </w:r>
+    </w:p>
+    <w:p>
+      <w:pPr>
+        <w:pStyle w:val="FirstParagraph"/>
+      </w:pPr>
+      <w:r>
+        <w:t xml:space="preserve">Choose</w:t>
+      </w:r>
+      <w:r>
+        <w:t xml:space="preserve"> </w:t>
+      </w:r>
+      <w:r>
+        <w:rPr>
+          <w:b/>
+          <w:bCs/>
+        </w:rPr>
+        <w:t xml:space="preserve">2 topics</w:t>
+      </w:r>
+      <w:r>
+        <w:t xml:space="preserve"> </w:t>
+      </w:r>
+      <w:r>
+        <w:t xml:space="preserve">from the list below for today’s activity.</w:t>
+      </w:r>
+    </w:p>
+    <w:tbl>
+      <w:tblPr>
+        <w:tblW w:type="pct" w:w="5000"/>
+        <w:tblStyle w:val="Table"/>
+        <w:tblLayout w:type="fixed"/>
+        <w:tblLook w:firstRow="1" w:lastRow="0" w:firstColumn="0" w:lastColumn="0" w:noHBand="0" w:noVBand="0" w:val="0020"/>
+        <w:tblBorders>
+          <w:top w:val="single" w:sz="4" w:space="0" w:color="000000"/>
+          <w:left w:val="single" w:sz="4" w:space="0" w:color="000000"/>
+          <w:bottom w:val="single" w:sz="4" w:space="0" w:color="000000"/>
+          <w:right w:val="single" w:sz="4" w:space="0" w:color="000000"/>
+          <w:insideH w:val="single" w:sz="4" w:space="0" w:color="000000"/>
+          <w:insideV w:val="single" w:sz="4" w:space="0" w:color="000000"/>
+        </w:tblBorders>
+      </w:tblPr>
+      <w:tblGrid>
+        <w:gridCol w:w="880"/>
+        <w:gridCol w:w="2053"/>
+        <w:gridCol w:w="2053"/>
+        <w:gridCol w:w="2933"/>
+      </w:tblGrid>
+      <w:tr>
+        <w:trPr>
+          <w:tblHeader w:val="on"/>
+        </w:trPr>
+        <w:tc>
+          <w:tcPr/>
+          <w:p>
+            <w:pPr>
+              <w:pStyle w:val="Compact"/>
+            </w:pPr>
+            <w:r>
+              <w:t xml:space="preserve">#</w:t>
+            </w:r>
+          </w:p>
+        </w:tc>
+        <w:tc>
+          <w:tcPr/>
+          <w:p>
+            <w:pPr>
+              <w:pStyle w:val="Compact"/>
+            </w:pPr>
+            <w:r>
+              <w:t xml:space="preserve">Topic</w:t>
+            </w:r>
+          </w:p>
+        </w:tc>
+        <w:tc>
+          <w:tcPr/>
+          <w:p>
+            <w:pPr>
+              <w:pStyle w:val="Compact"/>
+            </w:pPr>
+            <w:r>
+              <w:t xml:space="preserve">Agree</w:t>
+            </w:r>
+          </w:p>
+        </w:tc>
+        <w:tc>
+          <w:tcPr/>
+          <w:p>
+            <w:pPr>
+              <w:pStyle w:val="Compact"/>
+            </w:pPr>
+            <w:r>
+              <w:t xml:space="preserve">Disagree</w:t>
+            </w:r>
+          </w:p>
+        </w:tc>
+      </w:tr>
+      <w:tr>
+        <w:tc>
+          <w:tcPr/>
+          <w:p>
+            <w:pPr>
+              <w:pStyle w:val="Compact"/>
+            </w:pPr>
+            <w:r>
+              <w:t xml:space="preserve">1</w:t>
+            </w:r>
+          </w:p>
+        </w:tc>
+        <w:tc>
+          <w:tcPr/>
+          <w:p>
+            <w:pPr>
+              <w:pStyle w:val="Compact"/>
+            </w:pPr>
+            <w:r>
+              <w:t xml:space="preserve">Should companies be allowed to analyze employee emails without individual consent if it improves training programs?</w:t>
+            </w:r>
+          </w:p>
+        </w:tc>
+        <w:tc>
+          <w:tcPr/>
+          <w:p>
+            <w:pPr>
+              <w:pStyle w:val="Compact"/>
+            </w:pPr>
+            <w:r>
+              <w:t xml:space="preserve">Organizations have a legitimate need to use all available data to improve workforce development</w:t>
+            </w:r>
+          </w:p>
+        </w:tc>
+        <w:tc>
+          <w:tcPr/>
+          <w:p>
+            <w:pPr>
+              <w:pStyle w:val="Compact"/>
+            </w:pPr>
+            <w:r>
+              <w:t xml:space="preserve">Employees have a right to privacy, and email analysis without consent crosses an ethical line</w:t>
+            </w:r>
+          </w:p>
+        </w:tc>
+      </w:tr>
+      <w:tr>
+        <w:tc>
+          <w:tcPr/>
+          <w:p>
+            <w:pPr>
+              <w:pStyle w:val="Compact"/>
+            </w:pPr>
+            <w:r>
+              <w:t xml:space="preserve">2</w:t>
+            </w:r>
+          </w:p>
+        </w:tc>
+        <w:tc>
+          <w:tcPr/>
+          <w:p>
+            <w:pPr>
+              <w:pStyle w:val="Compact"/>
+            </w:pPr>
+            <w:r>
+              <w:t xml:space="preserve">Are AI-generated job descriptions more accurate than those written by managers?</w:t>
+            </w:r>
+          </w:p>
+        </w:tc>
+        <w:tc>
+          <w:tcPr/>
+          <w:p>
+            <w:pPr>
+              <w:pStyle w:val="Compact"/>
+            </w:pPr>
+            <w:r>
+              <w:t xml:space="preserve">AI can identify patterns across thousands of roles and remove individual bias from job descriptions</w:t>
+            </w:r>
+          </w:p>
+        </w:tc>
+        <w:tc>
+          <w:tcPr/>
+          <w:p>
+            <w:pPr>
+              <w:pStyle w:val="Compact"/>
+            </w:pPr>
+            <w:r>
+              <w:t xml:space="preserve">Managers understand the nuances, culture, and unwritten aspects of roles that AI cannot capture</w:t>
+            </w:r>
+          </w:p>
+        </w:tc>
+      </w:tr>
+      <w:tr>
+        <w:tc>
+          <w:tcPr/>
+          <w:p>
+            <w:pPr>
+              <w:pStyle w:val="Compact"/>
+            </w:pPr>
+            <w:r>
+              <w:t xml:space="preserve">3</w:t>
+            </w:r>
+          </w:p>
+        </w:tc>
+        <w:tc>
+          <w:tcPr/>
+          <w:p>
+            <w:pPr>
+              <w:pStyle w:val="Compact"/>
+            </w:pPr>
+            <w:r>
+              <w:t xml:space="preserve">Is heavy reliance on a few key employees a sign of leadership failure?</w:t>
+            </w:r>
+          </w:p>
+        </w:tc>
+        <w:tc>
+          <w:tcPr/>
+          <w:p>
+            <w:pPr>
+              <w:pStyle w:val="Compact"/>
+            </w:pPr>
+            <w:r>
+              <w:t xml:space="preserve">Good leaders build systems and develop talent so no single person is indispensable</w:t>
+            </w:r>
+          </w:p>
+        </w:tc>
+        <w:tc>
+          <w:tcPr/>
+          <w:p>
+            <w:pPr>
+              <w:pStyle w:val="Compact"/>
+            </w:pPr>
+            <w:r>
+              <w:t xml:space="preserve">Some roles naturally require specialized expertise, and retaining key talent is a leadership strength</w:t>
+            </w:r>
+          </w:p>
+        </w:tc>
+      </w:tr>
+      <w:tr>
+        <w:tc>
+          <w:tcPr/>
+          <w:p>
+            <w:pPr>
+              <w:pStyle w:val="Compact"/>
+            </w:pPr>
+            <w:r>
+              <w:t xml:space="preserve">4</w:t>
+            </w:r>
+          </w:p>
+        </w:tc>
+        <w:tc>
+          <w:tcPr/>
+          <w:p>
+            <w:pPr>
+              <w:pStyle w:val="Compact"/>
+            </w:pPr>
+            <w:r>
+              <w:t xml:space="preserve">Should companies implement real-time email monitoring to identify training needs as they emerge?</w:t>
+            </w:r>
+          </w:p>
+        </w:tc>
+        <w:tc>
+          <w:tcPr/>
+          <w:p>
+            <w:pPr>
+              <w:pStyle w:val="Compact"/>
+            </w:pPr>
+            <w:r>
+              <w:t xml:space="preserve">Real-time insights allow organizations to address skill gaps immediately rather than waiting for annual reviews</w:t>
+            </w:r>
+          </w:p>
+        </w:tc>
+        <w:tc>
+          <w:tcPr/>
+          <w:p>
+            <w:pPr>
+              <w:pStyle w:val="Compact"/>
+            </w:pPr>
+            <w:r>
+              <w:t xml:space="preserve">Constant monitoring creates a surveillance culture that destroys trust and psychological safety</w:t>
+            </w:r>
+          </w:p>
+        </w:tc>
+      </w:tr>
+      <w:tr>
+        <w:tc>
+          <w:tcPr/>
+          <w:p>
+            <w:pPr>
+              <w:pStyle w:val="Compact"/>
+            </w:pPr>
+            <w:r>
+              <w:t xml:space="preserve">5</w:t>
+            </w:r>
+          </w:p>
+        </w:tc>
+        <w:tc>
+          <w:tcPr/>
+          <w:p>
+            <w:pPr>
+              <w:pStyle w:val="Compact"/>
+            </w:pPr>
+            <w:r>
+              <w:t xml:space="preserve">Can AI-powered training programs fully replace traditional two-week onboarding programs?</w:t>
+            </w:r>
+          </w:p>
+        </w:tc>
+        <w:tc>
+          <w:tcPr/>
+          <w:p>
+            <w:pPr>
+              <w:pStyle w:val="Compact"/>
+            </w:pPr>
+            <w:r>
+              <w:t xml:space="preserve">AI can personalize learning paths, adapt to individual pace, and deliver training more efficiently than standardized programs</w:t>
+            </w:r>
+          </w:p>
+        </w:tc>
+        <w:tc>
+          <w:tcPr/>
+          <w:p>
+            <w:pPr>
+              <w:pStyle w:val="Compact"/>
+            </w:pPr>
+            <w:r>
+              <w:t xml:space="preserve">Human connection, mentorship, and cultural immersion during onboarding cannot be replicated by AI</w:t>
+            </w:r>
+          </w:p>
+        </w:tc>
+      </w:tr>
+      <w:tr>
+        <w:tc>
+          <w:tcPr/>
+          <w:p>
+            <w:pPr>
+              <w:pStyle w:val="Compact"/>
+            </w:pPr>
+            <w:r>
+              <w:t xml:space="preserve">6</w:t>
+            </w:r>
+          </w:p>
+        </w:tc>
+        <w:tc>
+          <w:tcPr/>
+          <w:p>
+            <w:pPr>
+              <w:pStyle w:val="Compact"/>
+            </w:pPr>
+            <w:r>
+              <w:t xml:space="preserve">If workplace success depends more on relationships than skills, does formal onboarding training even matter?</w:t>
+            </w:r>
+          </w:p>
+        </w:tc>
+        <w:tc>
+          <w:tcPr/>
+          <w:p>
+            <w:pPr>
+              <w:pStyle w:val="Compact"/>
+            </w:pPr>
+            <w:r>
+              <w:t xml:space="preserve">What really determines success is who you know and how well you navigate office politics, not what you learned in training</w:t>
+            </w:r>
+          </w:p>
+        </w:tc>
+        <w:tc>
+          <w:tcPr/>
+          <w:p>
+            <w:pPr>
+              <w:pStyle w:val="Compact"/>
+            </w:pPr>
+            <w:r>
+              <w:t xml:space="preserve">Structured onboarding provides the foundational knowledge and confidence new employees need to build those relationships effectively</w:t>
+            </w:r>
+          </w:p>
+        </w:tc>
+      </w:tr>
+    </w:tbl>
+    <w:p>
+      <w:pPr>
+        <w:pStyle w:val="BodyText"/>
+      </w:pPr>
+      <w:r>
+        <w:rPr>
+          <w:b/>
+          <w:bCs/>
+        </w:rPr>
+        <w:t xml:space="preserve">Our team’s selected topics:</w:t>
+      </w:r>
+    </w:p>
+    <w:tbl>
+      <w:tblPr>
+        <w:tblW w:type="pct" w:w="5000"/>
+        <w:tblStyle w:val="Table"/>
+        <w:tblLook w:firstRow="1" w:lastRow="0" w:firstColumn="0" w:lastColumn="0" w:noHBand="0" w:noVBand="0" w:val="0020"/>
+        <w:tblBorders>
+          <w:top w:val="single" w:sz="4" w:space="0" w:color="000000"/>
+          <w:left w:val="single" w:sz="4" w:space="0" w:color="000000"/>
+          <w:bottom w:val="single" w:sz="4" w:space="0" w:color="000000"/>
+          <w:right w:val="single" w:sz="4" w:space="0" w:color="000000"/>
+          <w:insideH w:val="single" w:sz="4" w:space="0" w:color="000000"/>
+          <w:insideV w:val="single" w:sz="4" w:space="0" w:color="000000"/>
+        </w:tblBorders>
+      </w:tblPr>
+      <w:tblGrid>
+        <w:gridCol w:w="2640"/>
+        <w:gridCol w:w="2640"/>
+        <w:gridCol w:w="2640"/>
+      </w:tblGrid>
+      <w:tr>
+        <w:trPr>
+          <w:tblHeader w:val="on"/>
+        </w:trPr>
+        <w:tc>
+          <w:tcPr/>
+          <w:p>
+            <w:pPr>
+              <w:pStyle w:val="Compact"/>
+            </w:pPr>
+            <w:r>
               <w:t xml:space="preserve">Order</w:t>
             </w:r>
           </w:p>
@@ -1542,7 +1541,7 @@
         <w:pStyle w:val="FirstParagraph"/>
       </w:pPr>
       <w:r>
-        <w:t xml:space="preserve">Partner A = Employee Advocate, Partner B = Employer Advocate</w:t>
+        <w:t xml:space="preserve">Partner A = Agree Advocate, Partner B = Disagree Advocate</w:t>
       </w:r>
     </w:p>
     <w:tbl>
@@ -1609,7 +1608,7 @@
               <w:pStyle w:val="Compact"/>
             </w:pPr>
             <w:r>
-              <w:t xml:space="preserve">Employee side argues to Employer</w:t>
+              <w:t xml:space="preserve">Agree side argues to Disagree</w:t>
             </w:r>
           </w:p>
         </w:tc>
@@ -1633,7 +1632,7 @@
               <w:pStyle w:val="Compact"/>
             </w:pPr>
             <w:r>
-              <w:t xml:space="preserve">Employer side argues to Employee</w:t>
+              <w:t xml:space="preserve">Disagree side argues to Agree</w:t>
             </w:r>
           </w:p>
         </w:tc>
@@ -1798,7 +1797,7 @@
         <w:t xml:space="preserve"> </w:t>
       </w:r>
       <w:r>
-        <w:t xml:space="preserve">Partner A = Employer Advocate, Partner B = Employee Advocate</w:t>
+        <w:t xml:space="preserve">Partner A = Disagree Advocate, Partner B = Agree Advocate</w:t>
       </w:r>
     </w:p>
     <w:tbl>
@@ -1865,7 +1864,7 @@
               <w:pStyle w:val="Compact"/>
             </w:pPr>
             <w:r>
-              <w:t xml:space="preserve">Employer side argues to Employee</w:t>
+              <w:t xml:space="preserve">Disagree side argues to Agree</w:t>
             </w:r>
           </w:p>
         </w:tc>
@@ -1889,7 +1888,7 @@
               <w:pStyle w:val="Compact"/>
             </w:pPr>
             <w:r>
-              <w:t xml:space="preserve">Employee side argues to Employer</w:t>
+              <w:t xml:space="preserve">Agree side argues to Disagree</w:t>
             </w:r>
           </w:p>
         </w:tc>

</xml_diff>